<commit_message>
Fill live Vercel URL into website guide
Co-Authored-By: Claude Opus 4.7 (1M context) <noreply@anthropic.com>
</commit_message>
<xml_diff>
--- a/Charlotte Website Guide.docx
+++ b/Charlotte Website Guide.docx
@@ -114,7 +114,7 @@
           </w:tcPr>
           <w:p>
             <w:r>
-              <w:t>Temporary web address</w:t>
+              <w:t>Working web address (live now)</w:t>
             </w:r>
           </w:p>
         </w:tc>
@@ -124,7 +124,7 @@
           </w:tcPr>
           <w:p>
             <w:r>
-              <w:t>&lt;filled in after the first deploy, e.g. personal-website.vercel.app&gt;</w:t>
+              <w:t>https://charlottewangmusic.vercel.app</w:t>
             </w:r>
           </w:p>
         </w:tc>
@@ -146,7 +146,7 @@
           </w:tcPr>
           <w:p>
             <w:r>
-              <w:t>&lt;your-site&gt;/keystatic</w:t>
+              <w:t>https://charlottewangmusic.vercel.app/keystatic</w:t>
             </w:r>
           </w:p>
         </w:tc>
@@ -186,7 +186,7 @@
         <w:rPr>
           <w:color w:val="5F4D3C"/>
         </w:rPr>
-        <w:t>Go to  &lt;your-site&gt;/keystatic  in your browser.</w:t>
+        <w:t>Go to  https://charlottewangmusic.vercel.app/keystatic  in your browser.</w:t>
       </w:r>
     </w:p>
     <w:p>

</xml_diff>